<commit_message>
changes in asi3 added D type cross validation
</commit_message>
<xml_diff>
--- a/Asi3/Report.docx
+++ b/Asi3/Report.docx
@@ -49,67 +49,42 @@
         <w:pStyle w:val="ListParagraph"/>
       </w:pPr>
       <w:r>
-        <w:t>The pair level</w:t>
-      </w:r>
-      <w:r>
-        <w:t xml:space="preserve"> Leave one out cross validation works like leaving out only one pair while many pairs with the same drug and pro</w:t>
-      </w:r>
-      <w:r>
-        <w:t>tein</w:t>
-      </w:r>
-      <w:r>
-        <w:t xml:space="preserve"> remain in the training set. </w:t>
-      </w:r>
-      <w:r>
-        <w:t>This is because the</w:t>
-      </w:r>
-      <w:r>
-        <w:t xml:space="preserve"> validation measured </w:t>
-      </w:r>
-      <w:r>
-        <w:t xml:space="preserve">among the familiar entities, while the </w:t>
-      </w:r>
-      <w:r>
-        <w:t xml:space="preserve">model should be trained such that it can extrapolate. With the pair </w:t>
-      </w:r>
-      <w:r>
-        <w:t>level LOOCV the model is optimistic and overfitted.</w:t>
-      </w:r>
-      <w:r>
-        <w:t xml:space="preserve"> For tackling this problem what we can do is hold out all pairs of one drug and hold out all </w:t>
-      </w:r>
-      <w:r>
-        <w:t>pairs</w:t>
-      </w:r>
-      <w:r>
-        <w:t xml:space="preserve"> of one protein </w:t>
-      </w:r>
-      <w:r>
-        <w:t>as each entity level folds preserve independence.</w:t>
-      </w:r>
-      <w:r>
-        <w:t xml:space="preserve"> </w:t>
-      </w:r>
-      <w:r>
-        <w:t>So,</w:t>
-      </w:r>
-      <w:r>
-        <w:t xml:space="preserve"> using the Leave One Drug </w:t>
-      </w:r>
-      <w:r>
-        <w:t>Out and</w:t>
-      </w:r>
-      <w:r>
-        <w:t xml:space="preserve"> Leave One Protein Out validations</w:t>
-      </w:r>
-      <w:r>
-        <w:t xml:space="preserve"> are the correct </w:t>
-      </w:r>
-      <w:r>
-        <w:t>way</w:t>
-      </w:r>
-      <w:r>
-        <w:t xml:space="preserve"> for the cross validation in this case.</w:t>
+        <w:t>The original pair-level leave-one-out cross-validation failed because it leaves out only one row (one pair) at a time, while rows containing the same drug and/or the same protein are still present in training. That creates information leakage at the entity level and gives an overly optimistic estimate.</w:t>
+      </w:r>
+    </w:p>
+    <w:p>
+      <w:pPr>
+        <w:pStyle w:val="ListParagraph"/>
+      </w:pPr>
+    </w:p>
+    <w:p>
+      <w:pPr>
+        <w:pStyle w:val="ListParagraph"/>
+      </w:pPr>
+      <w:r>
+        <w:t>Based on the teacher feedback and the deployment scenario, the correct target validation here is Type D</w:t>
+      </w:r>
+      <w:r>
+        <w:t>,</w:t>
+      </w:r>
+      <w:r>
+        <w:t xml:space="preserve"> unseen drug and unseen target (protein) at the same time. In Type D, we split drug IDs and protein IDs into disjoint train/test sets, train only on train-drug x train-protein </w:t>
+      </w:r>
+      <w:proofErr w:type="gramStart"/>
+      <w:r>
+        <w:t>pairs, and</w:t>
+      </w:r>
+      <w:proofErr w:type="gramEnd"/>
+      <w:r>
+        <w:t xml:space="preserve"> evaluate on test-drug x test-protein pairs. This matches the </w:t>
+      </w:r>
+      <w:proofErr w:type="gramStart"/>
+      <w:r>
+        <w:t>colleague</w:t>
+      </w:r>
+      <w:proofErr w:type="gramEnd"/>
+      <w:r>
+        <w:t xml:space="preserve"> scenario much better, because both sides are unseen from the model perspective.</w:t>
       </w:r>
     </w:p>
     <w:p>
@@ -137,52 +112,28 @@
         <w:pStyle w:val="ListParagraph"/>
       </w:pPr>
       <w:r>
-        <w:t xml:space="preserve">If we </w:t>
-      </w:r>
-      <w:r>
-        <w:t xml:space="preserve">were to see the code implementation according to the prompt. The agent did well in implementing the code </w:t>
-      </w:r>
-      <w:r>
-        <w:t>correctly,</w:t>
-      </w:r>
-      <w:r>
-        <w:t xml:space="preserve"> but it also fell for the same issue that the client mentioned in the letter. It is maybe because we explicitly told him to write the KNN with Leave one out validation and it did exactly that. </w:t>
-      </w:r>
-      <w:r>
-        <w:t>However,</w:t>
-      </w:r>
-      <w:r>
-        <w:t xml:space="preserve"> it did not </w:t>
-      </w:r>
-      <w:r>
-        <w:t>think</w:t>
-      </w:r>
-      <w:r>
-        <w:t xml:space="preserve"> that it is better to use Leave Drug Out and Leave Protein Out. </w:t>
-      </w:r>
-      <w:r>
-        <w:t xml:space="preserve">But with the conversation going on for </w:t>
-      </w:r>
-      <w:r>
-        <w:t>part</w:t>
-      </w:r>
-      <w:r>
-        <w:t xml:space="preserve"> 2 it successfully figured out that we can use other strategies to make the model stop from </w:t>
-      </w:r>
-      <w:r>
-        <w:t>overfitting</w:t>
-      </w:r>
-      <w:r>
-        <w:t xml:space="preserve"> and optimistic results.</w:t>
-      </w:r>
-      <w:r>
-        <w:t xml:space="preserve"> Finally, the algorithms of LOOC are correct and </w:t>
-      </w:r>
-      <w:r>
-        <w:t>do not</w:t>
-      </w:r>
-      <w:r>
-        <w:t xml:space="preserve"> require any change or so.</w:t>
+        <w:t>AI coded many technical parts correctly from the beginning: loading files, implementing KNN regression with K=10, creating C-index, and producing plots. The initial weakness was in the cross-validation core: it used pair-level leave-one-out, which is not the right estimate for unseen-entity deployment.</w:t>
+      </w:r>
+    </w:p>
+    <w:p>
+      <w:pPr>
+        <w:pStyle w:val="ListParagraph"/>
+      </w:pPr>
+    </w:p>
+    <w:p>
+      <w:pPr>
+        <w:pStyle w:val="ListParagraph"/>
+      </w:pPr>
+      <w:r>
+        <w:t xml:space="preserve">After iteration, AI-generated code was improved to entity-aware validation (LODO/LOPO) and then further revised to Type D, which is the correct requirement for this resubmission. </w:t>
+      </w:r>
+      <w:proofErr w:type="gramStart"/>
+      <w:r>
+        <w:t>So</w:t>
+      </w:r>
+      <w:proofErr w:type="gramEnd"/>
+      <w:r>
+        <w:t xml:space="preserve"> the main correction was not the model itself, but the validation protocol used to estimate generalization.</w:t>
       </w:r>
     </w:p>
     <w:p>
@@ -300,7 +251,15 @@
           <w:b/>
           <w:bCs/>
         </w:rPr>
-        <w:t xml:space="preserve">What results did you get with your implementation? Report the estimates and interpret the results in terms of how well the model will work in the situations described in the letter. Explain in detail why your cross-validation is the correct way to estimate the </w:t>
+        <w:t xml:space="preserve">What results did you get with your implementation? Report the estimates and interpret the results in terms of how well the model will work in the situations </w:t>
+      </w:r>
+      <w:r>
+        <w:rPr>
+          <w:b/>
+          <w:bCs/>
+        </w:rPr>
+        <w:lastRenderedPageBreak/>
+        <w:t xml:space="preserve">described in the letter. Explain in detail why your cross-validation is the correct way to estimate the </w:t>
       </w:r>
       <w:proofErr w:type="spellStart"/>
       <w:r>
@@ -373,7 +332,6 @@
         </w:numPr>
       </w:pPr>
       <w:r>
-        <w:lastRenderedPageBreak/>
         <w:t>Leave One Drug Out C index is: 0.</w:t>
       </w:r>
       <w:r>
@@ -402,104 +360,140 @@
     </w:p>
     <w:p>
       <w:pPr>
-        <w:ind w:left="720"/>
-      </w:pPr>
-      <w:r>
-        <w:t xml:space="preserve">With the following results the client </w:t>
-      </w:r>
-      <w:r>
-        <w:t>scenarios for</w:t>
-      </w:r>
-      <w:r>
-        <w:t xml:space="preserve"> the </w:t>
-      </w:r>
-      <w:r>
-        <w:t>colleague’s</w:t>
-      </w:r>
-      <w:r>
-        <w:t xml:space="preserve"> drugs and proteins are still not perfect. The Leave One Drug out especially gives a warning signal here. The C index is</w:t>
-      </w:r>
-      <w:r>
-        <w:t xml:space="preserve"> 0.5 which means ranking is close to random for unseen drugs, so using this model to prioritize those compounds is risky. </w:t>
-      </w:r>
-      <w:r>
-        <w:t>However,</w:t>
-      </w:r>
-      <w:r>
-        <w:t xml:space="preserve"> the Leave One Protein Out is much higher. </w:t>
+        <w:pStyle w:val="ListParagraph"/>
+        <w:numPr>
+          <w:ilvl w:val="0"/>
+          <w:numId w:val="4"/>
+        </w:numPr>
+      </w:pPr>
+      <w:r>
+        <w:t>Type D repeated results (5 runs):</w:t>
+      </w:r>
+    </w:p>
+    <w:p>
+      <w:pPr>
+        <w:pStyle w:val="ListParagraph"/>
+        <w:numPr>
+          <w:ilvl w:val="0"/>
+          <w:numId w:val="4"/>
+        </w:numPr>
+      </w:pPr>
+      <w:r>
+        <w:tab/>
+        <w:t>Iteration 1: 0.6320</w:t>
+      </w:r>
+    </w:p>
+    <w:p>
+      <w:pPr>
+        <w:pStyle w:val="ListParagraph"/>
+        <w:numPr>
+          <w:ilvl w:val="0"/>
+          <w:numId w:val="4"/>
+        </w:numPr>
+      </w:pPr>
+      <w:r>
+        <w:tab/>
+        <w:t>Iteration 2: 0.6071</w:t>
+      </w:r>
+    </w:p>
+    <w:p>
+      <w:pPr>
+        <w:pStyle w:val="ListParagraph"/>
+        <w:numPr>
+          <w:ilvl w:val="0"/>
+          <w:numId w:val="4"/>
+        </w:numPr>
+      </w:pPr>
+      <w:r>
+        <w:tab/>
+        <w:t>Iteration 3: 0.6250</w:t>
+      </w:r>
+    </w:p>
+    <w:p>
+      <w:pPr>
+        <w:pStyle w:val="ListParagraph"/>
+        <w:numPr>
+          <w:ilvl w:val="0"/>
+          <w:numId w:val="4"/>
+        </w:numPr>
+      </w:pPr>
+      <w:r>
+        <w:tab/>
+        <w:t>Iteration 4: 0.3464</w:t>
+      </w:r>
+    </w:p>
+    <w:p>
+      <w:pPr>
+        <w:pStyle w:val="ListParagraph"/>
+        <w:numPr>
+          <w:ilvl w:val="0"/>
+          <w:numId w:val="4"/>
+        </w:numPr>
+      </w:pPr>
+      <w:r>
+        <w:tab/>
+        <w:t>Iteration 5: 0.6677</w:t>
+      </w:r>
+    </w:p>
+    <w:p>
+      <w:pPr>
+        <w:pStyle w:val="ListParagraph"/>
+        <w:numPr>
+          <w:ilvl w:val="0"/>
+          <w:numId w:val="4"/>
+        </w:numPr>
+      </w:pPr>
+      <w:r>
+        <w:tab/>
+        <w:t>Average: 0.5757 +- 0.1163</w:t>
+      </w:r>
+    </w:p>
+    <w:p>
+      <w:pPr>
+        <w:pStyle w:val="ListParagraph"/>
+        <w:numPr>
+          <w:ilvl w:val="0"/>
+          <w:numId w:val="4"/>
+        </w:numPr>
+      </w:pPr>
+      <w:r>
+        <w:tab/>
+        <w:t>Min/Max: 0.3464 / 0.6677</w:t>
+      </w:r>
+    </w:p>
+    <w:p>
+      <w:pPr>
+        <w:pStyle w:val="ListParagraph"/>
+      </w:pPr>
+    </w:p>
+    <w:p>
+      <w:pPr>
+        <w:pStyle w:val="ListParagraph"/>
+      </w:pPr>
+      <w:r>
+        <w:t xml:space="preserve">The pair-level and LOPO scores are high, but they do not reflect the hardest deployment </w:t>
       </w:r>
       <w:proofErr w:type="gramStart"/>
       <w:r>
-        <w:t>So</w:t>
+        <w:t>condition</w:t>
       </w:r>
       <w:proofErr w:type="gramEnd"/>
       <w:r>
-        <w:t xml:space="preserve"> the model generalizes better </w:t>
-      </w:r>
-      <w:r>
-        <w:t>across the proteins than across the drugs in this dataset.</w:t>
-      </w:r>
-    </w:p>
-    <w:p>
-      <w:pPr>
-        <w:ind w:left="720"/>
-      </w:pPr>
-      <w:r>
-        <w:t xml:space="preserve">Why this cross validation is the correct way to estimate the generalization performance is because the </w:t>
-      </w:r>
-      <w:r>
-        <w:t xml:space="preserve">deployment is about the unseen entities, not just the unseen pair rows. And with the clients </w:t>
-      </w:r>
-      <w:proofErr w:type="gramStart"/>
-      <w:r>
-        <w:t>approach</w:t>
-      </w:r>
-      <w:proofErr w:type="gramEnd"/>
-      <w:r>
-        <w:t xml:space="preserve"> </w:t>
-      </w:r>
-      <w:r>
-        <w:t xml:space="preserve">Pair level LOOCV tests one row at a time while keeping same drug or protein </w:t>
-      </w:r>
-      <w:r>
-        <w:t xml:space="preserve">in training </w:t>
-      </w:r>
-      <w:proofErr w:type="gramStart"/>
-      <w:r>
-        <w:t>which over</w:t>
-      </w:r>
-      <w:proofErr w:type="gramEnd"/>
-      <w:r>
-        <w:t xml:space="preserve"> </w:t>
-      </w:r>
-      <w:proofErr w:type="gramStart"/>
-      <w:r>
-        <w:t>optimize</w:t>
-      </w:r>
-      <w:proofErr w:type="gramEnd"/>
-      <w:r>
-        <w:t xml:space="preserve"> the model and make it </w:t>
-      </w:r>
-      <w:r>
-        <w:t>optimistic</w:t>
-      </w:r>
-      <w:r>
-        <w:t xml:space="preserve">. The LODO/LOPO enforce fold independence at entity level as discussed in </w:t>
-      </w:r>
-      <w:r>
-        <w:t>previous</w:t>
-      </w:r>
-      <w:r>
-        <w:t xml:space="preserve"> sections.</w:t>
-      </w:r>
-      <w:r>
-        <w:t xml:space="preserve"> This matches the real protein tasks, so these estimates are more trustworthy for real-world use.</w:t>
-      </w:r>
-    </w:p>
-    <w:p>
-      <w:pPr>
-        <w:pStyle w:val="ListParagraph"/>
-      </w:pPr>
+        <w:t xml:space="preserve"> where both entities are unseen. LODO is near random (about 0.51), showing weak generalization to unseen drugs. Type D average performance is clearly lower than LOPO and has high variability across repeats, which indicates unstable ranking quality when both drug and protein are unseen.</w:t>
+      </w:r>
+    </w:p>
+    <w:p>
+      <w:pPr>
+        <w:pStyle w:val="ListParagraph"/>
+      </w:pPr>
+    </w:p>
+    <w:p>
+      <w:pPr>
+        <w:pStyle w:val="ListParagraph"/>
+      </w:pPr>
+      <w:r>
+        <w:t>Therefore, for the exact colleague scenario in the letter (new proteins and new drugs), Type D is the most appropriate estimate, and it suggests the current model is not reliable enough for high-confidence prioritization without further improvements.</w:t>
+      </w:r>
     </w:p>
     <w:p>
       <w:pPr>

</xml_diff>